<commit_message>
Primeiro Teste de Alinhamento de titulo
</commit_message>
<xml_diff>
--- a/neo.docx
+++ b/neo.docx
@@ -4,10 +4,15 @@
   <w:body>
     <w:p>
       <w:pPr>
-        <w:pStyle w:val="Title"/>
+        <w:pStyle w:val="Heading8"/>
       </w:pPr>
       <w:r>
         <w:t>Titulo Marinho da silva</w:t>
+      </w:r>
+    </w:p>
+    <w:p>
+      <w:r>
+        <w:t>Oi pessoal do github, deem like no video e se inscrevam</w:t>
       </w:r>
     </w:p>
     <w:sectPr>

</xml_diff>

<commit_message>
Teste do Italico e paragrafo
</commit_message>
<xml_diff>
--- a/neo.docx
+++ b/neo.docx
@@ -4,15 +4,21 @@
   <w:body>
     <w:p>
       <w:pPr>
-        <w:pStyle w:val="Heading8"/>
+        <w:pStyle w:val="Title"/>
       </w:pPr>
       <w:r>
-        <w:t>Titulo Marinho da silva</w:t>
+        <w:t>Titulo Centralizado</w:t>
       </w:r>
     </w:p>
     <w:p>
       <w:r>
-        <w:t>Oi pessoal do github, deem like no video e se inscrevam</w:t>
+        <w:t xml:space="preserve">Teste de Paragrafo: 1    </w:t>
+      </w:r>
+      <w:r>
+        <w:rPr>
+          <w:i/>
+        </w:rPr>
+        <w:t>Teste de Paragrafo: 2</w:t>
       </w:r>
     </w:p>
     <w:sectPr>

</xml_diff>